<commit_message>
frontend improvements and final ws1 items integrated
</commit_message>
<xml_diff>
--- a/lbs-files/raw/ws1/Post-Space Request Completion Output Spec.docx
+++ b/lbs-files/raw/ws1/Post-Space Request Completion Output Spec.docx
@@ -362,6 +362,7 @@
         <w:spacing w:after="120" w:line="252" w:lineRule="auto"/>
       </w:pPr>
       <w:r>
+        <w:lastRenderedPageBreak/>
         <w:t>3. Completion Screen Rules</w:t>
       </w:r>
       <w:r>
@@ -527,14 +528,7 @@
               <w:rPr>
                 <w:sz w:val="16"/>
               </w:rPr>
-              <w:t xml:space="preserve">Show preview and download controls for the completed Space Request </w:t>
-            </w:r>
-            <w:r>
-              <w:rPr>
-                <w:sz w:val="16"/>
-              </w:rPr>
-              <w:lastRenderedPageBreak/>
-              <w:t>Form.</w:t>
+              <w:t>Show preview and download controls for the completed Space Request Form.</w:t>
             </w:r>
           </w:p>
         </w:tc>
@@ -564,7 +558,6 @@
               <w:rPr>
                 <w:sz w:val="16"/>
               </w:rPr>
-              <w:lastRenderedPageBreak/>
               <w:t>Space Management email step</w:t>
             </w:r>
           </w:p>
@@ -695,7 +688,13 @@
               <w:rPr>
                 <w:sz w:val="16"/>
               </w:rPr>
-              <w:t>Show the step plus a button/prompt: 'What do I need to create a Campus Groups event page?'</w:t>
+              <w:t>Show</w:t>
+            </w:r>
+            <w:r>
+              <w:rPr>
+                <w:sz w:val="16"/>
+              </w:rPr>
+              <w:t xml:space="preserve"> guidance in the event readiness panel, after stakeholders and emails</w:t>
             </w:r>
           </w:p>
         </w:tc>
@@ -775,7 +774,19 @@
               <w:rPr>
                 <w:sz w:val="16"/>
               </w:rPr>
-              <w:t>Show only if the event profile includes alumni, external guests, industry partners, or other non-LBS attendees.</w:t>
+              <w:t xml:space="preserve">Show </w:t>
+            </w:r>
+            <w:r>
+              <w:rPr>
+                <w:sz w:val="16"/>
+              </w:rPr>
+              <w:t xml:space="preserve">guidance in the events readiness panel, </w:t>
+            </w:r>
+            <w:r>
+              <w:rPr>
+                <w:sz w:val="16"/>
+              </w:rPr>
+              <w:t>only if the event profile includes alumni, external guests, industry partners, or other non-LBS attendees.</w:t>
             </w:r>
           </w:p>
         </w:tc>
@@ -855,7 +866,19 @@
               <w:rPr>
                 <w:sz w:val="16"/>
               </w:rPr>
-              <w:t>Show the copy/paste email draft immediately under the SA Tech &amp; Ops step.</w:t>
+              <w:t>Show the copy/paste email draft immediately under the SA Tech &amp; Ops step</w:t>
+            </w:r>
+            <w:r>
+              <w:rPr>
+                <w:sz w:val="16"/>
+              </w:rPr>
+              <w:t xml:space="preserve"> in the events readiness panel, </w:t>
+            </w:r>
+            <w:r>
+              <w:rPr>
+                <w:sz w:val="16"/>
+              </w:rPr>
+              <w:t>only if the event profile includes alumni, external guests, industry partners, or other non-LBS attendees</w:t>
             </w:r>
           </w:p>
         </w:tc>
@@ -1118,6 +1141,7 @@
         <w:spacing w:after="120" w:line="252" w:lineRule="auto"/>
       </w:pPr>
       <w:r>
+        <w:lastRenderedPageBreak/>
         <w:t>6. Campus Groups Walkthrough Button</w:t>
       </w:r>
     </w:p>
@@ -1162,11 +1186,7 @@
               </w:rPr>
             </w:pPr>
             <w:r>
-              <w:t xml:space="preserve">The completion screen should not display the full Campus Groups setup details by default. It should show a button or </w:t>
-            </w:r>
-            <w:r>
-              <w:lastRenderedPageBreak/>
-              <w:t>prompt: 'What do I need to create a Campus Groups event page?' When selected, the assistant opens the Campus Groups setup support flow.</w:t>
+              <w:t>The completion screen should not display the full Campus Groups setup details by default. It should show a button or prompt: 'What do I need to create a Campus Groups event page?' When selected, the assistant opens the Campus Groups setup support flow.</w:t>
             </w:r>
           </w:p>
         </w:tc>
@@ -1178,7 +1198,6 @@
         <w:spacing w:after="120" w:line="252" w:lineRule="auto"/>
       </w:pPr>
       <w:r>
-        <w:lastRenderedPageBreak/>
         <w:t>7. Expanded Campus Groups Setup Support</w:t>
       </w:r>
     </w:p>
@@ -1956,6 +1975,7 @@
         <w:spacing w:after="120" w:line="252" w:lineRule="auto"/>
       </w:pPr>
       <w:r>
+        <w:lastRenderedPageBreak/>
         <w:t>10. Expanded Campus Groups Response Pattern</w:t>
       </w:r>
     </w:p>
@@ -1997,7 +2017,6 @@
               <w:rPr>
                 <w:sz w:val="18"/>
               </w:rPr>
-              <w:lastRenderedPageBreak/>
               <w:t>- Event name</w:t>
             </w:r>
             <w:r>
@@ -14285,4 +14304,10 @@
     <ds:schemaRef ds:uri="http://schemas.openxmlformats.org/officeDocument/2006/bibliography"/>
   </ds:schemaRefs>
 </ds:datastoreItem>
+</file>
+
+<file path=docMetadata/LabelInfo.xml><?xml version="1.0" encoding="utf-8"?>
+<clbl:labelList xmlns:clbl="http://schemas.microsoft.com/office/2020/mipLabelMetadata">
+  <clbl:label id="{b556776d-8a0f-4dc9-bb5c-b5e28f8e36fe}" enabled="0" method="" siteId="{b556776d-8a0f-4dc9-bb5c-b5e28f8e36fe}" removed="1"/>
+</clbl:labelList>
 </file>
</xml_diff>